<commit_message>
Complete Sprint 1 and UI polish
</commit_message>
<xml_diff>
--- a/Project Status.docx
+++ b/Project Status.docx
@@ -422,7 +422,7 @@
         <w:rPr>
           <w:rtl w:val="0"/>
         </w:rPr>
-        <w:t xml:space="preserve">Sprint 1 – Application Foundation</w:t>
+        <w:t xml:space="preserve">Sprint 2 – Authentication</w:t>
       </w:r>
     </w:p>
     <w:p>
@@ -1258,7 +1258,7 @@
         </w:rPr>
         <w:t xml:space="preserve">Status:</w:t>
         <w:br w:type="textWrapping"/>
-        <w:t xml:space="preserve">Ready</w:t>
+        <w:t xml:space="preserve">Completed</w:t>
       </w:r>
     </w:p>
     <w:p>
@@ -1311,7 +1311,7 @@
         </w:rPr>
         <w:t xml:space="preserve">Status:</w:t>
         <w:br w:type="textWrapping"/>
-        <w:t xml:space="preserve">Not Started</w:t>
+        <w:t xml:space="preserve">Ready</w:t>
       </w:r>
     </w:p>
     <w:p>
@@ -1841,7 +1841,7 @@
         <w:rPr>
           <w:rtl w:val="0"/>
         </w:rPr>
-        <w:t xml:space="preserve">Execute Sprint 1.</w:t>
+        <w:t xml:space="preserve">Execute Sprint 2.</w:t>
       </w:r>
     </w:p>
     <w:p>
@@ -2424,7 +2424,7 @@
         </w:rPr>
         <w:t xml:space="preserve">Development Progress:</w:t>
         <w:br w:type="textWrapping"/>
-        <w:t xml:space="preserve">Sprint 0 Complete</w:t>
+        <w:t xml:space="preserve">Sprint 1 Complete</w:t>
       </w:r>
     </w:p>
     <w:p>
@@ -2438,7 +2438,7 @@
         </w:rPr>
         <w:t xml:space="preserve">Next Milestone:</w:t>
         <w:br w:type="textWrapping"/>
-        <w:t xml:space="preserve">Sprint 1 Execution</w:t>
+        <w:t xml:space="preserve">Sprint 2 Execution</w:t>
       </w:r>
     </w:p>
     <w:p>

</xml_diff>

<commit_message>
Complete Sprint 2 authentication system
</commit_message>
<xml_diff>
--- a/Project Status.docx
+++ b/Project Status.docx
@@ -422,7 +422,7 @@
         <w:rPr>
           <w:rtl w:val="0"/>
         </w:rPr>
-        <w:t xml:space="preserve">Sprint 2 – Authentication</w:t>
+        <w:t xml:space="preserve">Sprint 3 – User Profiles</w:t>
       </w:r>
     </w:p>
     <w:p>
@@ -1311,7 +1311,7 @@
         </w:rPr>
         <w:t xml:space="preserve">Status:</w:t>
         <w:br w:type="textWrapping"/>
-        <w:t xml:space="preserve">Ready</w:t>
+        <w:t xml:space="preserve">Completed</w:t>
       </w:r>
     </w:p>
     <w:p>
@@ -1364,7 +1364,7 @@
         </w:rPr>
         <w:t xml:space="preserve">Status:</w:t>
         <w:br w:type="textWrapping"/>
-        <w:t xml:space="preserve">Not Started</w:t>
+        <w:t xml:space="preserve">Ready</w:t>
       </w:r>
     </w:p>
     <w:p>
@@ -1841,7 +1841,7 @@
         <w:rPr>
           <w:rtl w:val="0"/>
         </w:rPr>
-        <w:t xml:space="preserve">Execute Sprint 2.</w:t>
+        <w:t xml:space="preserve">Execute Sprint 3.</w:t>
       </w:r>
     </w:p>
     <w:p>
@@ -2424,7 +2424,7 @@
         </w:rPr>
         <w:t xml:space="preserve">Development Progress:</w:t>
         <w:br w:type="textWrapping"/>
-        <w:t xml:space="preserve">Sprint 1 Complete</w:t>
+        <w:t xml:space="preserve">Sprint 2 Complete</w:t>
       </w:r>
     </w:p>
     <w:p>
@@ -2438,7 +2438,7 @@
         </w:rPr>
         <w:t xml:space="preserve">Next Milestone:</w:t>
         <w:br w:type="textWrapping"/>
-        <w:t xml:space="preserve">Sprint 2 Execution</w:t>
+        <w:t xml:space="preserve">Sprint 3 Execution</w:t>
       </w:r>
     </w:p>
     <w:p>

</xml_diff>